<commit_message>
Finalizando a estrutura bruta do relatório
</commit_message>
<xml_diff>
--- a/test_out.docx
+++ b/test_out.docx
@@ -2562,7 +2562,522 @@
           <w:rFonts w:ascii="Aptos" w:hAnsi="Aptos"/>
           <w:sz w:val="22"/>
         </w:rPr>
-        <w:t>As Não Conformidades registradas no Quadro 1, a seguir, associadas aos respectivos subtrechos, foram avaliadas pelos valores do Índice de Gravidade Global (IGG) que ultrapassaram o limite máximo previsto ≥ 30, como também os valores do Índice Irregularidade Longitudinal (IRI) que ultrapassaram o limite máximo previsto ≥ 2,7 m/km constantes do Relatório Anual 01 de novembro/2025 elaborado pelo Verificador Independente.</w:t>
+        <w:t>Os trechos com Não Conformidades registradas no Quadro 1 e Quadro 2, a seguir, associadas aos respectivos subtrechos, foram avaliadas pelos valores do Índice de Gravidade Global (IGG) que ultrapassaram o limite máximo previsto ≥ 30, como também os valores do Índice Irregularidade Longitudinal (IRI) que ultrapassaram o limite máximo previsto ≥ 2,7 m/km constantes do Relatório Anual 01 de novembro/2025 elaborado pelo Verificador Independente.</w:t>
+      </w:r>
+    </w:p>
+    <w:p/>
+    <w:p>
+      <w:pPr>
+        <w:spacing w:after="120"/>
+        <w:jc w:val="center"/>
+      </w:pPr>
+      <w:r>
+        <w:rPr>
+          <w:rFonts w:ascii="Aptos" w:hAnsi="Aptos"/>
+          <w:sz w:val="22"/>
+        </w:rPr>
+        <w:t>Quadro 1 – Aplicação dos Critérios de Elegibilidade Relativos ao Pavimento PE009</w:t>
+      </w:r>
+    </w:p>
+    <w:p>
+      <w:pPr>
+        <w:spacing w:after="120"/>
+        <w:jc w:val="center"/>
+      </w:pPr>
+      <w:r>
+        <w:rPr>
+          <w:rFonts w:ascii="Aptos" w:hAnsi="Aptos"/>
+          <w:sz w:val="22"/>
+        </w:rPr>
+        <w:t>Quadro 2 – Aplicação dos Critérios de Elegibilidade Relativos ao Pavimento VPE034</w:t>
+      </w:r>
+    </w:p>
+    <w:p>
+      <w:pPr>
+        <w:spacing w:after="120" w:line="276" w:lineRule="auto"/>
+        <w:jc w:val="both"/>
+      </w:pPr>
+      <w:r>
+        <w:rPr>
+          <w:rFonts w:ascii="Aptos" w:hAnsi="Aptos"/>
+          <w:sz w:val="22"/>
+        </w:rPr>
+        <w:t>Visando garantir um pavimento de qualidade com a trafegabilidade e segurança viária para os usuários sugere-se que os Pontos de Atenção registrados no Quadro 3 sejam, tratados pela concessionaria. A seguir, estão associados aos respectivos subtrechos, possuem índices de Índice de Gravidade Global (IGG) e/ou Índice de Irregularidade Longitudinal (IRI) que não ultrapassaram o limite máximos previstos constantes do Relatório Anual 01 de novembro/2025 elaborado pelo Verificador Independente.</w:t>
+      </w:r>
+    </w:p>
+    <w:p/>
+    <w:p>
+      <w:pPr>
+        <w:spacing w:after="120"/>
+        <w:jc w:val="center"/>
+      </w:pPr>
+      <w:r>
+        <w:rPr>
+          <w:rFonts w:ascii="Aptos" w:hAnsi="Aptos"/>
+          <w:sz w:val="22"/>
+        </w:rPr>
+        <w:t>Quadro 3 – Trecho dos pontos de Atenção:</w:t>
+      </w:r>
+    </w:p>
+    <w:p/>
+    <w:p>
+      <w:pPr>
+        <w:spacing w:after="120" w:line="276" w:lineRule="auto"/>
+        <w:jc w:val="both"/>
+      </w:pPr>
+      <w:r>
+        <w:rPr>
+          <w:rFonts w:ascii="Aptos" w:hAnsi="Aptos"/>
+          <w:sz w:val="22"/>
+        </w:rPr>
+        <w:t xml:space="preserve">O </w:t>
+      </w:r>
+      <w:r>
+        <w:rPr>
+          <w:rFonts w:ascii="Aptos" w:hAnsi="Aptos"/>
+          <w:b/>
+          <w:sz w:val="22"/>
+        </w:rPr>
+        <w:t>Quadro 4</w:t>
+      </w:r>
+      <w:r>
+        <w:rPr>
+          <w:rFonts w:ascii="Aptos" w:hAnsi="Aptos"/>
+          <w:sz w:val="22"/>
+        </w:rPr>
+        <w:t xml:space="preserve">, a seguir, resume as Não Conformidades constatadas, relacionadas ao PDCL, com indicação dos respectivos registros fotográficos no </w:t>
+      </w:r>
+      <w:r>
+        <w:rPr>
+          <w:rFonts w:ascii="Aptos" w:hAnsi="Aptos"/>
+          <w:b/>
+          <w:sz w:val="22"/>
+        </w:rPr>
+        <w:t>Apêndice A</w:t>
+      </w:r>
+      <w:r>
+        <w:rPr>
+          <w:rFonts w:ascii="Aptos" w:hAnsi="Aptos"/>
+          <w:sz w:val="22"/>
+        </w:rPr>
+        <w:t xml:space="preserve"> e Pontos de Atenção respectivos registros fotográficos no </w:t>
+      </w:r>
+      <w:r>
+        <w:rPr>
+          <w:rFonts w:ascii="Aptos" w:hAnsi="Aptos"/>
+          <w:b/>
+          <w:sz w:val="22"/>
+        </w:rPr>
+        <w:t>Apêndice B</w:t>
+      </w:r>
+      <w:r>
+        <w:rPr>
+          <w:rFonts w:ascii="Aptos" w:hAnsi="Aptos"/>
+          <w:sz w:val="22"/>
+        </w:rPr>
+        <w:t>. A descrição da evidência está referenciada conforme a norma de descrição de defeitos do DNIT.</w:t>
+      </w:r>
+    </w:p>
+    <w:p/>
+    <w:p>
+      <w:pPr>
+        <w:spacing w:after="120"/>
+        <w:jc w:val="center"/>
+      </w:pPr>
+      <w:r>
+        <w:rPr>
+          <w:rFonts w:ascii="Aptos" w:hAnsi="Aptos"/>
+          <w:b/>
+          <w:sz w:val="22"/>
+        </w:rPr>
+        <w:t>Quadro 4</w:t>
+      </w:r>
+      <w:r>
+        <w:rPr>
+          <w:rFonts w:ascii="Aptos" w:hAnsi="Aptos"/>
+          <w:sz w:val="22"/>
+        </w:rPr>
+        <w:t xml:space="preserve"> – Não Conformidades por Rodovia/Sentido</w:t>
+      </w:r>
+    </w:p>
+    <w:p/>
+    <w:p>
+      <w:pPr>
+        <w:spacing w:after="120"/>
+        <w:jc w:val="center"/>
+      </w:pPr>
+      <w:r>
+        <w:rPr>
+          <w:rFonts w:ascii="Aptos" w:hAnsi="Aptos"/>
+          <w:b/>
+          <w:sz w:val="22"/>
+        </w:rPr>
+        <w:t>Quadro 5</w:t>
+      </w:r>
+      <w:r>
+        <w:rPr>
+          <w:rFonts w:ascii="Aptos" w:hAnsi="Aptos"/>
+          <w:sz w:val="22"/>
+        </w:rPr>
+        <w:t xml:space="preserve"> – Pontos de Atenção por Rodovia/Sentido</w:t>
+      </w:r>
+    </w:p>
+    <w:p/>
+    <w:p/>
+    <w:p/>
+    <w:p/>
+    <w:p>
+      <w:pPr>
+        <w:spacing w:before="240" w:after="120"/>
+      </w:pPr>
+      <w:r>
+        <w:rPr>
+          <w:b/>
+          <w:sz w:val="24"/>
+        </w:rPr>
+        <w:t>5. DETERMINAÇÕES GERAIS</w:t>
+      </w:r>
+    </w:p>
+    <w:p/>
+    <w:p>
+      <w:pPr>
+        <w:spacing w:after="120" w:line="276" w:lineRule="auto"/>
+        <w:jc w:val="both"/>
+      </w:pPr>
+      <w:r>
+        <w:rPr>
+          <w:rFonts w:ascii="Aptos" w:hAnsi="Aptos"/>
+          <w:sz w:val="22"/>
+        </w:rPr>
+        <w:t>Considerando os dispositivos contratuais pertinentes e visando garantir a qualidade dos serviços prestados, determina-se que a CRA tome as seguintes medidas através de um plano de ação:</w:t>
+      </w:r>
+    </w:p>
+    <w:p>
+      <w:pPr>
+        <w:spacing w:after="120" w:line="276" w:lineRule="auto"/>
+        <w:jc w:val="both"/>
+      </w:pPr>
+      <w:r>
+        <w:rPr>
+          <w:rFonts w:ascii="Aptos" w:hAnsi="Aptos"/>
+          <w:b/>
+          <w:sz w:val="22"/>
+        </w:rPr>
+        <w:t>Medidas de Manutenção / Conservação,</w:t>
+      </w:r>
+      <w:r>
+        <w:rPr>
+          <w:rFonts w:ascii="Aptos" w:hAnsi="Aptos"/>
+          <w:sz w:val="22"/>
+        </w:rPr>
+        <w:t xml:space="preserve"> detalhando cronograma com trechos a executar de forma que permita à Arpe uma programação mais efetiva do monitoramento de suas soluções a execução de cada subtrecho, conforme o modelo encaminhado para 2025 (Cronograma de Conserva Especial do Pavimento CRA 2025).</w:t>
+      </w:r>
+    </w:p>
+    <w:p>
+      <w:pPr>
+        <w:spacing w:after="120" w:line="276" w:lineRule="auto"/>
+        <w:jc w:val="both"/>
+      </w:pPr>
+      <w:r>
+        <w:rPr>
+          <w:rFonts w:ascii="Aptos" w:hAnsi="Aptos"/>
+          <w:b/>
+          <w:sz w:val="22"/>
+        </w:rPr>
+        <w:t>Medidas imediatas</w:t>
+      </w:r>
+      <w:r>
+        <w:rPr>
+          <w:rFonts w:ascii="Aptos" w:hAnsi="Aptos"/>
+          <w:sz w:val="22"/>
+        </w:rPr>
+        <w:t xml:space="preserve"> resolutividade das NC de Sinalização, nos prazos estabelecidos no subitem 4.1.3.3.2.4. Tachas e Tachões Refletivos do PDCL, conforme disposto no Quadro 1, na coluna denominada Determinações.</w:t>
+      </w:r>
+    </w:p>
+    <w:p/>
+    <w:p>
+      <w:pPr>
+        <w:spacing w:before="240" w:after="120"/>
+      </w:pPr>
+      <w:r>
+        <w:rPr>
+          <w:b/>
+          <w:sz w:val="24"/>
+        </w:rPr>
+        <w:t>6. RECOMENDAÇÕES</w:t>
+      </w:r>
+    </w:p>
+    <w:p/>
+    <w:p>
+      <w:pPr>
+        <w:spacing w:after="120" w:line="276" w:lineRule="auto"/>
+        <w:jc w:val="both"/>
+      </w:pPr>
+      <w:r>
+        <w:rPr>
+          <w:rFonts w:ascii="Aptos" w:hAnsi="Aptos"/>
+          <w:sz w:val="22"/>
+        </w:rPr>
+        <w:t>Considerando as disposições do Contrato de Concessão, em especial, o Anexo IV - PDCL, Outras Sinalizações, dados do Relatório Anual 01 de novembro/2025 elaborado VI, e outras legislação aplicável, devem ser observadas pela CRA as seguintes recomendações:</w:t>
+      </w:r>
+    </w:p>
+    <w:p>
+      <w:pPr>
+        <w:spacing w:after="120" w:line="276" w:lineRule="auto"/>
+        <w:jc w:val="both"/>
+      </w:pPr>
+      <w:r>
+        <w:rPr>
+          <w:rFonts w:ascii="Aptos" w:hAnsi="Aptos"/>
+          <w:sz w:val="22"/>
+        </w:rPr>
+        <w:t>Levantar a necessidade de reposição da SINALIZAÇÃO por tachas e tachões em todo o complexo viário Express Way,  em especial a retirada das tachar anteriores danificadas que podem causar risco a segurança dos usuários. O vi verificou deficiências em todos os trechos.</w:t>
+      </w:r>
+    </w:p>
+    <w:p/>
+    <w:p>
+      <w:pPr>
+        <w:spacing w:before="240" w:after="120"/>
+      </w:pPr>
+      <w:r>
+        <w:rPr>
+          <w:b/>
+          <w:sz w:val="24"/>
+        </w:rPr>
+        <w:t>7. CONCLUSÕES</w:t>
+      </w:r>
+    </w:p>
+    <w:p/>
+    <w:p>
+      <w:pPr>
+        <w:spacing w:after="120" w:line="276" w:lineRule="auto"/>
+        <w:jc w:val="both"/>
+      </w:pPr>
+      <w:r>
+        <w:rPr>
+          <w:rFonts w:ascii="Aptos" w:hAnsi="Aptos"/>
+          <w:sz w:val="22"/>
+        </w:rPr>
+        <w:t>Tendo em vista as ações de fiscalização realizadas pela Arpe foram constatadas quatorze (14) pontos ou trechos fiscalizados que apresentaram Não Conformidades distribuídas majoritariamente na PE 009, estas foram analisadas e caracterizadas a partir dos indicadores do Grupo Condição de Superfície definidos no Contrato de Concessão CT. nº 043/2011.</w:t>
+      </w:r>
+    </w:p>
+    <w:p>
+      <w:pPr>
+        <w:spacing w:after="120" w:line="276" w:lineRule="auto"/>
+        <w:jc w:val="both"/>
+      </w:pPr>
+      <w:r>
+        <w:rPr>
+          <w:rFonts w:ascii="Aptos" w:hAnsi="Aptos"/>
+          <w:sz w:val="22"/>
+        </w:rPr>
+        <w:t>Assim considerando a Programação de Conserva Especial do Pavimento - CRA 2026, solicita-se a inclusão destas não conformidades no cronograma detalhado de Conserva Especial do Pavimento que permita à Arpe uma realização mais efetiva dos monitoramentos ao longo de 2026.</w:t>
+      </w:r>
+    </w:p>
+    <w:p>
+      <w:pPr>
+        <w:spacing w:after="120" w:line="276" w:lineRule="auto"/>
+        <w:jc w:val="both"/>
+      </w:pPr>
+      <w:r>
+        <w:rPr>
+          <w:rFonts w:ascii="Aptos" w:hAnsi="Aptos"/>
+          <w:sz w:val="22"/>
+        </w:rPr>
+        <w:t>Recomenda-se, por fim, o encaminhamento deste Relatório de Fiscalização para que Suape, na qualidade de Gestor do Contrato e Regulador desse Sistema Viário, realize as providências cabíveis junto à Concessionária Rota do Atlântico com o objetivo de garantir a regularização das Não Conformidades pendentes apontadas por esta Agência de Regulação.</w:t>
+      </w:r>
+    </w:p>
+    <w:p>
+      <w:pPr>
+        <w:spacing w:after="120"/>
+        <w:jc w:val="both"/>
+      </w:pPr>
+      <w:r>
+        <w:rPr>
+          <w:rFonts w:ascii="Aptos" w:hAnsi="Aptos"/>
+          <w:sz w:val="22"/>
+        </w:rPr>
+        <w:t>Recife, data da assinatura eletrônica.</w:t>
+      </w:r>
+    </w:p>
+    <w:p/>
+    <w:p>
+      <w:pPr>
+        <w:spacing w:before="240" w:after="120"/>
+      </w:pPr>
+      <w:r>
+        <w:rPr>
+          <w:b/>
+          <w:sz w:val="24"/>
+        </w:rPr>
+        <w:t>APÊNDICE A – REGISTROS FOTOGRÁFICOS DAS NÃO CONFORMIDADES</w:t>
+      </w:r>
+    </w:p>
+    <w:p/>
+    <w:p/>
+    <w:p/>
+    <w:p/>
+    <w:p>
+      <w:pPr>
+        <w:spacing w:before="240" w:after="120"/>
+      </w:pPr>
+      <w:r>
+        <w:rPr>
+          <w:b/>
+          <w:sz w:val="24"/>
+        </w:rPr>
+        <w:t>APÊNDICE B – REGISTROS FOTOGRÁFICOS DAS PONTOS DE ATENÇÃO</w:t>
+      </w:r>
+    </w:p>
+    <w:p/>
+    <w:p/>
+    <w:p>
+      <w:pPr>
+        <w:spacing w:before="240" w:after="240"/>
+      </w:pPr>
+      <w:r>
+        <w:rPr>
+          <w:rFonts w:ascii="Aptos" w:hAnsi="Aptos"/>
+          <w:sz w:val="22"/>
+        </w:rPr>
+        <w:t>Recife, data da assinatura eletrônica.</w:t>
+      </w:r>
+    </w:p>
+    <w:p/>
+    <w:p/>
+    <w:p>
+      <w:pPr>
+        <w:spacing w:after="0"/>
+        <w:jc w:val="center"/>
+      </w:pPr>
+      <w:r>
+        <w:rPr>
+          <w:rFonts w:ascii="Aptos" w:hAnsi="Aptos"/>
+          <w:b/>
+          <w:sz w:val="22"/>
+        </w:rPr>
+        <w:t>Alcides Vieira de Azevedo Bezerra</w:t>
+      </w:r>
+    </w:p>
+    <w:p>
+      <w:pPr>
+        <w:spacing w:after="0"/>
+        <w:jc w:val="center"/>
+      </w:pPr>
+      <w:r>
+        <w:rPr>
+          <w:rFonts w:ascii="Aptos" w:hAnsi="Aptos"/>
+          <w:sz w:val="22"/>
+        </w:rPr>
+        <w:t>Analista de Regulação</w:t>
+      </w:r>
+    </w:p>
+    <w:p>
+      <w:pPr>
+        <w:spacing w:after="240"/>
+        <w:jc w:val="center"/>
+      </w:pPr>
+      <w:r>
+        <w:rPr>
+          <w:rFonts w:ascii="Aptos" w:hAnsi="Aptos"/>
+          <w:sz w:val="22"/>
+        </w:rPr>
+        <w:t>Matrícula 40672015/01</w:t>
+      </w:r>
+    </w:p>
+    <w:p/>
+    <w:p>
+      <w:pPr>
+        <w:spacing w:after="0"/>
+        <w:jc w:val="center"/>
+      </w:pPr>
+      <w:r>
+        <w:rPr>
+          <w:rFonts w:ascii="Aptos" w:hAnsi="Aptos"/>
+          <w:b/>
+          <w:sz w:val="22"/>
+        </w:rPr>
+        <w:t>Enildo Manoel da Silva Júnior</w:t>
+      </w:r>
+    </w:p>
+    <w:p>
+      <w:pPr>
+        <w:spacing w:after="0"/>
+        <w:jc w:val="center"/>
+      </w:pPr>
+      <w:r>
+        <w:rPr>
+          <w:rFonts w:ascii="Aptos" w:hAnsi="Aptos"/>
+          <w:sz w:val="22"/>
+        </w:rPr>
+        <w:t>Analista de Regulação</w:t>
+      </w:r>
+    </w:p>
+    <w:p>
+      <w:pPr>
+        <w:spacing w:after="240"/>
+        <w:jc w:val="center"/>
+      </w:pPr>
+      <w:r>
+        <w:rPr>
+          <w:rFonts w:ascii="Aptos" w:hAnsi="Aptos"/>
+          <w:sz w:val="22"/>
+        </w:rPr>
+        <w:t>Matrícula nº 1796500/02</w:t>
+      </w:r>
+    </w:p>
+    <w:p/>
+    <w:p>
+      <w:pPr>
+        <w:spacing w:before="240" w:after="240"/>
+      </w:pPr>
+      <w:r>
+        <w:rPr>
+          <w:rFonts w:ascii="Aptos" w:hAnsi="Aptos"/>
+          <w:sz w:val="22"/>
+        </w:rPr>
+        <w:t>Ciente e de acordo.</w:t>
+      </w:r>
+    </w:p>
+    <w:p/>
+    <w:p>
+      <w:pPr>
+        <w:spacing w:after="0"/>
+        <w:jc w:val="center"/>
+      </w:pPr>
+      <w:r>
+        <w:rPr>
+          <w:rFonts w:ascii="Aptos" w:hAnsi="Aptos"/>
+          <w:b/>
+          <w:sz w:val="22"/>
+        </w:rPr>
+        <w:t>Maria Ângela Albuquerque de Freitas</w:t>
+      </w:r>
+    </w:p>
+    <w:p>
+      <w:pPr>
+        <w:spacing w:after="0"/>
+        <w:jc w:val="center"/>
+      </w:pPr>
+      <w:r>
+        <w:rPr>
+          <w:rFonts w:ascii="Aptos" w:hAnsi="Aptos"/>
+          <w:sz w:val="22"/>
+        </w:rPr>
+        <w:t>Coordenadora de Transportes e Rodovias</w:t>
+      </w:r>
+    </w:p>
+    <w:p>
+      <w:pPr>
+        <w:spacing w:after="240"/>
+        <w:jc w:val="center"/>
+      </w:pPr>
+      <w:r>
+        <w:rPr>
+          <w:rFonts w:ascii="Aptos" w:hAnsi="Aptos"/>
+          <w:sz w:val="22"/>
+        </w:rPr>
+        <w:t>Matrícula nº 209640/01</w:t>
       </w:r>
     </w:p>
     <w:sectPr>

</xml_diff>